<commit_message>
link to repo added
</commit_message>
<xml_diff>
--- a/Primeiro Procedimento - Trabalho - Desenv. Back-end Corporativo Com Java e Cloud.docx
+++ b/Primeiro Procedimento - Trabalho - Desenv. Back-end Corporativo Com Java e Cloud.docx
@@ -179,9 +179,41 @@
       </w:r>
       <w:proofErr w:type="spellEnd"/>
     </w:p>
-    <w:p/>
+    <w:p>
+      <w:pPr>
+        <w:jc w:val="center"/>
+      </w:pPr>
+      <w:hyperlink r:id="rId8" w:history="1">
+        <w:r>
+          <w:rPr>
+            <w:rStyle w:val="Hyperlink"/>
+          </w:rPr>
+          <w:t>Link do</w:t>
+        </w:r>
+        <w:r>
+          <w:rPr>
+            <w:rStyle w:val="Hyperlink"/>
+          </w:rPr>
+          <w:t xml:space="preserve"> </w:t>
+        </w:r>
+        <w:r>
+          <w:rPr>
+            <w:rStyle w:val="Hyperlink"/>
+          </w:rPr>
+          <w:t>Repositório</w:t>
+        </w:r>
+      </w:hyperlink>
+    </w:p>
     <w:sdt>
       <w:sdtPr>
+        <w:rPr>
+          <w:rFonts w:asciiTheme="minorHAnsi" w:eastAsiaTheme="minorHAnsi" w:hAnsiTheme="minorHAnsi" w:cstheme="minorBidi"/>
+          <w:color w:val="auto"/>
+          <w:sz w:val="22"/>
+          <w:szCs w:val="22"/>
+          <w:lang w:eastAsia="en-US"/>
+          <w14:ligatures w14:val="standardContextual"/>
+        </w:rPr>
         <w:id w:val="-1655359834"/>
         <w:docPartObj>
           <w:docPartGallery w:val="Table of Contents"/>
@@ -190,14 +222,8 @@
       </w:sdtPr>
       <w:sdtEndPr>
         <w:rPr>
-          <w:rFonts w:asciiTheme="minorHAnsi" w:eastAsiaTheme="minorHAnsi" w:hAnsiTheme="minorHAnsi" w:cstheme="minorBidi"/>
           <w:b/>
           <w:bCs/>
-          <w:color w:val="auto"/>
-          <w:sz w:val="22"/>
-          <w:szCs w:val="22"/>
-          <w:lang w:eastAsia="en-US"/>
-          <w14:ligatures w14:val="standardContextual"/>
         </w:rPr>
       </w:sdtEndPr>
       <w:sdtContent>
@@ -1536,6 +1562,9 @@
     </w:p>
     <w:p>
       <w:r>
+        <w:rPr>
+          <w:noProof/>
+        </w:rPr>
         <w:drawing>
           <wp:inline distT="0" distB="0" distL="0" distR="0" wp14:anchorId="153E32A2" wp14:editId="5DAB396D">
             <wp:extent cx="5943600" cy="4695825"/>
@@ -1552,7 +1581,7 @@
                     <pic:cNvPicPr/>
                   </pic:nvPicPr>
                   <pic:blipFill>
-                    <a:blip r:embed="rId8"/>
+                    <a:blip r:embed="rId9"/>
                     <a:stretch>
                       <a:fillRect/>
                     </a:stretch>
@@ -1668,6 +1697,9 @@
     </w:p>
     <w:p>
       <w:r>
+        <w:rPr>
+          <w:noProof/>
+        </w:rPr>
         <w:drawing>
           <wp:inline distT="0" distB="0" distL="0" distR="0" wp14:anchorId="39823175" wp14:editId="5DD69621">
             <wp:extent cx="5943600" cy="5015230"/>
@@ -1684,7 +1716,7 @@
                     <pic:cNvPicPr/>
                   </pic:nvPicPr>
                   <pic:blipFill>
-                    <a:blip r:embed="rId9"/>
+                    <a:blip r:embed="rId10"/>
                     <a:stretch>
                       <a:fillRect/>
                     </a:stretch>
@@ -1734,6 +1766,9 @@
     </w:p>
     <w:p>
       <w:r>
+        <w:rPr>
+          <w:noProof/>
+        </w:rPr>
         <w:drawing>
           <wp:inline distT="0" distB="0" distL="0" distR="0" wp14:anchorId="65A0CEB0" wp14:editId="16D2C6C5">
             <wp:extent cx="5943600" cy="4998085"/>
@@ -1750,7 +1785,7 @@
                     <pic:cNvPicPr/>
                   </pic:nvPicPr>
                   <pic:blipFill>
-                    <a:blip r:embed="rId10"/>
+                    <a:blip r:embed="rId11"/>
                     <a:stretch>
                       <a:fillRect/>
                     </a:stretch>
@@ -1792,6 +1827,9 @@
     </w:p>
     <w:p>
       <w:r>
+        <w:rPr>
+          <w:noProof/>
+        </w:rPr>
         <w:drawing>
           <wp:inline distT="0" distB="0" distL="0" distR="0" wp14:anchorId="03C88D58" wp14:editId="2AE46EBC">
             <wp:extent cx="5943600" cy="4995545"/>
@@ -1808,7 +1846,7 @@
                     <pic:cNvPicPr/>
                   </pic:nvPicPr>
                   <pic:blipFill>
-                    <a:blip r:embed="rId11"/>
+                    <a:blip r:embed="rId12"/>
                     <a:stretch>
                       <a:fillRect/>
                     </a:stretch>
@@ -1863,6 +1901,9 @@
     </w:p>
     <w:p>
       <w:r>
+        <w:rPr>
+          <w:noProof/>
+        </w:rPr>
         <w:drawing>
           <wp:inline distT="0" distB="0" distL="0" distR="0" wp14:anchorId="79446D47" wp14:editId="0CA5C159">
             <wp:extent cx="5943600" cy="5006975"/>
@@ -1879,7 +1920,7 @@
                     <pic:cNvPicPr/>
                   </pic:nvPicPr>
                   <pic:blipFill>
-                    <a:blip r:embed="rId12"/>
+                    <a:blip r:embed="rId13"/>
                     <a:stretch>
                       <a:fillRect/>
                     </a:stretch>
@@ -1924,7 +1965,7 @@
                     </pic:cNvPicPr>
                   </pic:nvPicPr>
                   <pic:blipFill>
-                    <a:blip r:embed="rId13" cstate="print">
+                    <a:blip r:embed="rId14" cstate="print">
                       <a:extLst>
                         <a:ext uri="{28A0092B-C50C-407E-A947-70E740481C1C}">
                           <a14:useLocalDpi xmlns:a14="http://schemas.microsoft.com/office/drawing/2010/main" val="0"/>
@@ -1972,6 +2013,9 @@
     </w:p>
     <w:p>
       <w:r>
+        <w:rPr>
+          <w:noProof/>
+        </w:rPr>
         <w:drawing>
           <wp:inline distT="0" distB="0" distL="0" distR="0" wp14:anchorId="2C0D3BE1" wp14:editId="0CDBE279">
             <wp:extent cx="5943600" cy="2281555"/>
@@ -1988,7 +2032,7 @@
                     <pic:cNvPicPr/>
                   </pic:nvPicPr>
                   <pic:blipFill>
-                    <a:blip r:embed="rId14"/>
+                    <a:blip r:embed="rId15"/>
                     <a:stretch>
                       <a:fillRect/>
                     </a:stretch>
@@ -2011,13 +2055,7 @@
     </w:p>
     <w:p>
       <w:r>
-        <w:t>P</w:t>
-      </w:r>
-      <w:r>
-        <w:t>or algum motivo, o mapping automático não aconteceu, por isso p</w:t>
-      </w:r>
-      <w:r>
-        <w:t>recisei adicionar o seguinte trecho no web.xml:</w:t>
+        <w:t>Por algum motivo, o mapping automático não aconteceu, por isso precisei adicionar o seguinte trecho no web.xml:</w:t>
       </w:r>
       <w:r>
         <w:t xml:space="preserve"> </w:t>
@@ -2044,7 +2082,7 @@
                     </pic:cNvPicPr>
                   </pic:nvPicPr>
                   <pic:blipFill>
-                    <a:blip r:embed="rId15" cstate="print">
+                    <a:blip r:embed="rId16" cstate="print">
                       <a:extLst>
                         <a:ext uri="{28A0092B-C50C-407E-A947-70E740481C1C}">
                           <a14:useLocalDpi xmlns:a14="http://schemas.microsoft.com/office/drawing/2010/main" val="0"/>
@@ -2113,7 +2151,7 @@
                     </pic:cNvPicPr>
                   </pic:nvPicPr>
                   <pic:blipFill>
-                    <a:blip r:embed="rId16" cstate="print">
+                    <a:blip r:embed="rId17" cstate="print">
                       <a:extLst>
                         <a:ext uri="{28A0092B-C50C-407E-A947-70E740481C1C}">
                           <a14:useLocalDpi xmlns:a14="http://schemas.microsoft.com/office/drawing/2010/main" val="0"/>
@@ -2150,6 +2188,9 @@
         <w:jc w:val="center"/>
       </w:pPr>
       <w:r>
+        <w:rPr>
+          <w:noProof/>
+        </w:rPr>
         <w:lastRenderedPageBreak/>
         <w:drawing>
           <wp:inline distT="0" distB="0" distL="0" distR="0" wp14:anchorId="5CFB18BC" wp14:editId="27F0DCEF">
@@ -2167,7 +2208,7 @@
                     <pic:cNvPicPr/>
                   </pic:nvPicPr>
                   <pic:blipFill>
-                    <a:blip r:embed="rId17"/>
+                    <a:blip r:embed="rId18"/>
                     <a:stretch>
                       <a:fillRect/>
                     </a:stretch>
@@ -2729,7 +2770,7 @@
                     </pic:cNvPicPr>
                   </pic:nvPicPr>
                   <pic:blipFill>
-                    <a:blip r:embed="rId18" cstate="print">
+                    <a:blip r:embed="rId19" cstate="print">
                       <a:extLst>
                         <a:ext uri="{28A0092B-C50C-407E-A947-70E740481C1C}">
                           <a14:useLocalDpi xmlns:a14="http://schemas.microsoft.com/office/drawing/2010/main" val="0"/>
@@ -2868,8 +2909,8 @@
     </w:p>
     <w:p/>
     <w:sectPr>
-      <w:footerReference w:type="default" r:id="rId19"/>
-      <w:footerReference w:type="first" r:id="rId20"/>
+      <w:footerReference w:type="default" r:id="rId20"/>
+      <w:footerReference w:type="first" r:id="rId21"/>
       <w:pgSz w:w="12240" w:h="15840"/>
       <w:pgMar w:top="1440" w:right="1440" w:bottom="1440" w:left="1440" w:header="720" w:footer="720" w:gutter="0"/>
       <w:cols w:space="720"/>
@@ -4115,6 +4156,7 @@
   <w:style w:type="character" w:default="1" w:styleId="DefaultParagraphFont">
     <w:name w:val="Default Paragraph Font"/>
     <w:uiPriority w:val="1"/>
+    <w:semiHidden/>
     <w:unhideWhenUsed/>
   </w:style>
   <w:style w:type="table" w:default="1" w:styleId="TableNormal">
@@ -4588,6 +4630,30 @@
       <w:szCs w:val="20"/>
     </w:rPr>
   </w:style>
+  <w:style w:type="character" w:styleId="UnresolvedMention">
+    <w:name w:val="Unresolved Mention"/>
+    <w:basedOn w:val="DefaultParagraphFont"/>
+    <w:uiPriority w:val="99"/>
+    <w:semiHidden/>
+    <w:unhideWhenUsed/>
+    <w:rsid w:val="00490335"/>
+    <w:rPr>
+      <w:color w:val="605E5C"/>
+      <w:shd w:val="clear" w:color="auto" w:fill="E1DFDD"/>
+    </w:rPr>
+  </w:style>
+  <w:style w:type="character" w:styleId="FollowedHyperlink">
+    <w:name w:val="FollowedHyperlink"/>
+    <w:basedOn w:val="DefaultParagraphFont"/>
+    <w:uiPriority w:val="99"/>
+    <w:semiHidden/>
+    <w:unhideWhenUsed/>
+    <w:rsid w:val="00490335"/>
+    <w:rPr>
+      <w:color w:val="96607D" w:themeColor="followedHyperlink"/>
+      <w:u w:val="single"/>
+    </w:rPr>
+  </w:style>
 </w:styles>
 </file>
 

</xml_diff>